<commit_message>
Apply expert reviewer comments to WRC-1992 warnings
- Composition limits and FN accuracy are now standing notes below the
  disclaimer ("less accurate", 84 %/70 % within +/-2.5/+/-9 FN), not warnings
- Outside-axes note uses the reviewer's wording, shown once
- No reference to martensite or other diagrams anywhere in the app
- Disclaimer replaced by the reviewer's text; FN vs vol-% explanation dropped
- Review documents (EN/SV) regenerated to reflect the second revision

Co-Authored-By: Claude Fable 5 <noreply@anthropic.com>
</commit_message>
<xml_diff>
--- a/WRC-1992-app-varningsgranskning-SV.docx
+++ b/WRC-1992-app-varningsgranskning-SV.docx
@@ -20,7 +20,7 @@
           <w:sz w:val="20"/>
           <w:szCs w:val="20"/>
         </w:rPr>
-        <w:t xml:space="preserve">Granskningsunderlag för en expert på svetsmetallurgi. Version 2026-09-06; beskriver appen så som den är driftsatt efter den källbaserade revisionen samma dag. App: wrc-1992.vercel.app. Kod: src/lib/warnings.ts.</w:t>
+        <w:t xml:space="preserve">Granskningsunderlag för en expert på svetsmetallurgi. Version 2026-09-09; beskriver appen så som den är driftsatt efter att granskarens kommentarer från den 9 september förts in (andra revisionen). App: wrc-1992.vercel.app. Kod: src/lib/warnings.ts.</w:t>
       </w:r>
     </w:p>
     <w:p>
@@ -287,7 +287,7 @@
                 <w:sz w:val="18"/>
                 <w:szCs w:val="18"/>
               </w:rPr>
-              <w:t xml:space="preserve">Material A (user-defined) has 3.20 % Mo, above the 3 % limit of the WRC-1992 database — the FN prediction is not reliable.</w:t>
+              <w:t xml:space="preserve">The prediction is less accurate above 10 % Mn, 3 % Mo, 0.2 % N or 1 % Si (Siewert, McCowan &amp; Olson 1988).</w:t>
             </w:r>
           </w:p>
         </w:tc>
@@ -318,7 +318,7 @@
                 <w:sz w:val="18"/>
                 <w:szCs w:val="18"/>
               </w:rPr>
-              <w:t xml:space="preserve">Mn &gt; 10, Mo &gt; 3, N &gt; 0,2 eller Si &gt; 1 vikt-% i material A, B eller C</w:t>
+              <w:t xml:space="preserve">Fast notis, visas alltid (var en varning per material t.o.m. 9 sept.)</w:t>
             </w:r>
           </w:p>
         </w:tc>
@@ -413,7 +413,7 @@
                 <w:sz w:val="18"/>
                 <w:szCs w:val="18"/>
               </w:rPr>
-              <w:t xml:space="preserve">Material B (EN 10025-2 / S355J2) lies outside the diagram axes. That is normal for unalloyed base metals — the mixing line remains valid as long as the weld metal point lands on the diagram.</w:t>
+              <w:t xml:space="preserve">Unalloyed base metals lie outside the diagram axes. The mixing line remains valid as long as the weld metal point lies on the diagram.</w:t>
             </w:r>
           </w:p>
         </w:tc>
@@ -444,7 +444,7 @@
                 <w:sz w:val="18"/>
                 <w:szCs w:val="18"/>
               </w:rPr>
-              <w:t xml:space="preserve">Cr</w:t>
+              <w:t xml:space="preserve">Något av A, B eller C med Cr</w:t>
             </w:r>
             <w:r>
               <w:rPr>
@@ -482,7 +482,7 @@
                 <w:sz w:val="18"/>
                 <w:szCs w:val="18"/>
               </w:rPr>
-              <w:t xml:space="preserve"> utanför 9–18 för A, B eller C</w:t>
+              <w:t xml:space="preserve"> utanför 9–18; visas en gång</w:t>
             </w:r>
           </w:p>
         </w:tc>
@@ -703,7 +703,7 @@
                 <w:sz w:val="18"/>
                 <w:szCs w:val="18"/>
               </w:rPr>
-              <w:t xml:space="preserve">The weld metal point lies outside the region covered by the iso-FN lines; extending the lines could give erroneous predictions. Below the lower FN lines martensite may form, which the WRC-1992 diagram does not show.</w:t>
+              <w:t xml:space="preserve">The weld metal point lies outside the region covered by the iso-FN lines; extending the lines could give erroneous predictions.</w:t>
             </w:r>
           </w:p>
         </w:tc>
@@ -829,7 +829,7 @@
                 <w:sz w:val="18"/>
                 <w:szCs w:val="18"/>
               </w:rPr>
-              <w:t xml:space="preserve">Predicted FN ≈ 56 is above 18, where the accuracy of the WRC-1992 prediction drops from about ±2.5 FN to about ±9 FN.</w:t>
+              <w:t xml:space="preserve">Accuracy of the WRC-1992 prediction (Siewert, McCowan &amp; Olson 1988): below 18 FN, 84 % of predictions fall within ±2.5 FN; above 18 FN, 70 % fall within ±9 FN.</w:t>
             </w:r>
           </w:p>
         </w:tc>
@@ -860,7 +860,7 @@
                 <w:sz w:val="18"/>
                 <w:szCs w:val="18"/>
               </w:rPr>
-              <w:t xml:space="preserve">Predikterat FN &gt; 18</w:t>
+              <w:t xml:space="preserve">Fast notis, visas alltid (var en varning över 18 FN t.o.m. 9 sept.)</w:t>
             </w:r>
           </w:p>
         </w:tc>
@@ -1081,7 +1081,7 @@
                 <w:sz w:val="18"/>
                 <w:szCs w:val="18"/>
               </w:rPr>
-              <w:t xml:space="preserve">WRC-1992 predicts Ferrite Number (FN), a magnetically defined scale — not volume-% ferrite; the two agree only at low FN (100 FN corresponds to roughly 65 vol-% ferrite). The prediction applies to weld metal at arc-welding cooling rates and is only valid inside the drawn iso-FN lines. The prediction is subject to the limitations and assumptions of the original WRC-1992 research.</w:t>
+              <w:t xml:space="preserve">WRC-1992 predicts Ferrite Number (FN). The prediction applies to weld metal at arc-welding cooling rates and is only valid inside the drawn iso-FN lines. The prediction is subject to the limitations and assumptions of the original WRC-1992 research.</w:t>
             </w:r>
           </w:p>
         </w:tc>
@@ -1200,7 +1200,7 @@
           <w:sz w:val="20"/>
           <w:szCs w:val="20"/>
         </w:rPr>
-        <w:t xml:space="preserve">“Material A (user-defined) has 3.20 % Mo, above the 3 % limit of the WRC-1992 database — the FN prediction is not reliable.”</w:t>
+        <w:t xml:space="preserve">“The prediction is less accurate above 10 % Mn, 3 % Mo, 0.2 % N or 1 % Si (Siewert, McCowan &amp; Olson 1988).”</w:t>
       </w:r>
     </w:p>
     <w:p>
@@ -1223,7 +1223,7 @@
         <w:spacing w:after="160" w:line="300"/>
       </w:pPr>
       <w:r>
-        <w:t xml:space="preserve">warnings.ts, konstanten LIMITS. Utvärderas för vart och ett av material A, B och tillsats C: Mn &gt; 10, Mo &gt; 3, N &gt; 0,2 eller Si &gt; 1 vikt-%, strikt jämförelse. Med de inbyggda materialen kan bara egendefinierade legeringar utlösa den.</w:t>
+        <w:t xml:space="preserve">warnings.ts, konstanten DISCLAIMER_NOTES. Visas alltid under ansvarsfriskrivningen; utvärderas inte längre per material. Fram till den 9 september var det en varning som utlöstes för varje material som överskred en gräns, med lydelsen ”the FN prediction is not reliable”; granskaren bad om ”less accurate” och om att gränserna skulle anges som en generell ansvarsfriskrivning med referens.</w:t>
       </w:r>
     </w:p>
     <w:p>
@@ -1369,10 +1369,18 @@
           <w:b/>
           <w:bCs/>
         </w:rPr>
-        <w:t xml:space="preserve">Verifierat.</w:t>
-      </w:r>
-      <w:r>
-        <w:t xml:space="preserve"> Gränserna är originalforskningens egna angivna villkor, precis vad den överenskomna principen tillåter. Observera att databasen i sig sträcker sig längre (tabell 1 i 1988-artikeln: Mn 0,4–12, Mo 0–7, N 0,03–0,3, Si 0,1–1,3); gränserna markerar var noggrannheten visats hålla, inte var data tar slut.</w:t>
+        <w:t xml:space="preserve">Verifierat och granskat.</w:t>
+      </w:r>
+      <w:r>
+        <w:t xml:space="preserve"> Gränserna är originalforskningens egna angivna villkor. Granskarens formulering (”less accurate”) stämmer med källan, som kvantifierar en försämrad noggrannhet snarare än en giltighetsgräns. Observera att databasen i sig sträcker sig längre (tabell 1 i 1988-artikeln: Mn 0,4–12, Mo 0–7, N 0,03–0,3, Si 0,1–1,3).</w:t>
+      </w:r>
+    </w:p>
+    <w:p>
+      <w:pPr>
+        <w:pStyle w:val="Heading2"/>
+      </w:pPr>
+      <w:r>
+        <w:t xml:space="preserve">W1: grundmaterial utanför axlarna</w:t>
       </w:r>
     </w:p>
     <w:p>
@@ -1387,7 +1395,814 @@
           <w:sz w:val="20"/>
           <w:szCs w:val="20"/>
         </w:rPr>
-        <w:t xml:space="preserve">Frågor till granskaren</w:t>
+        <w:t xml:space="preserve">Text i appen</w:t>
+      </w:r>
+    </w:p>
+    <w:p>
+      <w:pPr>
+        <w:pBdr>
+          <w:left w:val="single" w:color="1380a4" w:sz="12" w:space="8"/>
+        </w:pBdr>
+        <w:spacing w:after="120" w:line="280"/>
+        <w:ind w:left="567"/>
+      </w:pPr>
+      <w:r>
+        <w:rPr>
+          <w:i/>
+          <w:iCs/>
+          <w:sz w:val="20"/>
+          <w:szCs w:val="20"/>
+        </w:rPr>
+        <w:t xml:space="preserve">“Unalloyed base metals lie outside the diagram axes. The mixing line remains valid as long as the weld metal point lies on the diagram.”</w:t>
+      </w:r>
+    </w:p>
+    <w:p>
+      <w:pPr>
+        <w:spacing w:before="160" w:after="60"/>
+      </w:pPr>
+      <w:r>
+        <w:rPr>
+          <w:b/>
+          <w:bCs/>
+          <w:color w:val="1380a4"/>
+          <w:sz w:val="20"/>
+          <w:szCs w:val="20"/>
+        </w:rPr>
+        <w:t xml:space="preserve">Utlösning</w:t>
+      </w:r>
+    </w:p>
+    <w:p>
+      <w:pPr>
+        <w:spacing w:after="160" w:line="300"/>
+      </w:pPr>
+      <w:r>
+        <w:t xml:space="preserve">Visas en gång när något av material A, B eller C har Cr</w:t>
+      </w:r>
+      <w:r>
+        <w:rPr>
+          <w:vertAlign w:val="subscript"/>
+        </w:rPr>
+        <w:t xml:space="preserve">eq</w:t>
+      </w:r>
+      <w:r>
+        <w:t xml:space="preserve"> utanför 17–31 eller Ni</w:t>
+      </w:r>
+      <w:r>
+        <w:rPr>
+          <w:vertAlign w:val="subscript"/>
+        </w:rPr>
+        <w:t xml:space="preserve">eq</w:t>
+      </w:r>
+      <w:r>
+        <w:t xml:space="preserve"> utanför 9–18 (de ritade WRC-1992-axlarna). Utlöses för S355 i varje blandförbandsexempel. Formuleringen är granskarens; fram till den 9 september namngav texten materialet och var längre.</w:t>
+      </w:r>
+    </w:p>
+    <w:p>
+      <w:pPr>
+        <w:spacing w:before="160" w:after="60"/>
+      </w:pPr>
+      <w:r>
+        <w:rPr>
+          <w:b/>
+          <w:bCs/>
+          <w:color w:val="1380a4"/>
+          <w:sz w:val="20"/>
+          <w:szCs w:val="20"/>
+        </w:rPr>
+        <w:t xml:space="preserve">Underlag</w:t>
+      </w:r>
+    </w:p>
+    <w:p>
+      <w:pPr>
+        <w:spacing w:after="160" w:line="300"/>
+      </w:pPr>
+      <w:r>
+        <w:t xml:space="preserve">1992-artikeln inför de förlängda axlarna just för detta fall och räknar två exempel med olegerade grundmaterial (AISI 1050 och ASTM A36) placerade vid Cr</w:t>
+      </w:r>
+      <w:r>
+        <w:rPr>
+          <w:vertAlign w:val="subscript"/>
+        </w:rPr>
+        <w:t xml:space="preserve">eq</w:t>
+      </w:r>
+      <w:r>
+        <w:t xml:space="preserve"> = 0, för vilka inget FN kan beräknas men vars punkter förankrar utspädningslinjen.</w:t>
+      </w:r>
+    </w:p>
+    <w:p>
+      <w:pPr>
+        <w:pBdr>
+          <w:left w:val="single" w:color="1380a4" w:sz="12" w:space="8"/>
+        </w:pBdr>
+        <w:spacing w:after="40" w:line="280"/>
+        <w:ind w:left="567"/>
+      </w:pPr>
+      <w:r>
+        <w:rPr>
+          <w:i/>
+          <w:iCs/>
+          <w:sz w:val="20"/>
+          <w:szCs w:val="20"/>
+        </w:rPr>
+        <w:t xml:space="preserve">“Although Ferrite Numbers do not exist for weld deposits of low Crₑₖ and Niₑₖ, the positions of such alloys can still be located by extrapolated Crₑₖ and Niₑₖ units on the WRC-1992 diagram. Dilution calculations are based on linear combinations of the compositions, and the extended axes of the diagram allow visualization of the concept.”</w:t>
+      </w:r>
+    </w:p>
+    <w:p>
+      <w:pPr>
+        <w:spacing w:after="160"/>
+        <w:ind w:left="567"/>
+      </w:pPr>
+      <w:r>
+        <w:rPr>
+          <w:color w:val="555555"/>
+          <w:sz w:val="18"/>
+          <w:szCs w:val="18"/>
+        </w:rPr>
+        <w:t xml:space="preserve">– Kotecki &amp; Siewert 1992, p. 173-s</w:t>
+      </w:r>
+    </w:p>
+    <w:p>
+      <w:pPr>
+        <w:pBdr>
+          <w:left w:val="single" w:color="1380a4" w:sz="12" w:space="8"/>
+        </w:pBdr>
+        <w:spacing w:after="40" w:line="280"/>
+        <w:ind w:left="567"/>
+      </w:pPr>
+      <w:r>
+        <w:rPr>
+          <w:i/>
+          <w:iCs/>
+          <w:sz w:val="20"/>
+          <w:szCs w:val="20"/>
+        </w:rPr>
+        <w:t xml:space="preserve">“The Crₑₖ and Niₑₖ for the AISI 1050 steel (0.0 and 17.50, respectively) do not permit an FN calculation for this material.”</w:t>
+      </w:r>
+    </w:p>
+    <w:p>
+      <w:pPr>
+        <w:spacing w:after="160"/>
+        <w:ind w:left="567"/>
+      </w:pPr>
+      <w:r>
+        <w:rPr>
+          <w:color w:val="555555"/>
+          <w:sz w:val="18"/>
+          <w:szCs w:val="18"/>
+        </w:rPr>
+        <w:t xml:space="preserve">– Kotecki &amp; Siewert 1992, p. 173-s</w:t>
+      </w:r>
+    </w:p>
+    <w:p>
+      <w:pPr>
+        <w:spacing w:before="160" w:after="60"/>
+      </w:pPr>
+      <w:r>
+        <w:rPr>
+          <w:b/>
+          <w:bCs/>
+          <w:color w:val="1380a4"/>
+          <w:sz w:val="20"/>
+          <w:szCs w:val="20"/>
+        </w:rPr>
+        <w:t xml:space="preserve">Bedömning</w:t>
+      </w:r>
+    </w:p>
+    <w:p>
+      <w:pPr>
+        <w:spacing w:after="160" w:line="300"/>
+      </w:pPr>
+      <w:r>
+        <w:rPr>
+          <w:b/>
+          <w:bCs/>
+        </w:rPr>
+        <w:t xml:space="preserve">Verifierat och granskat.</w:t>
+      </w:r>
+      <w:r>
+        <w:t xml:space="preserve"> Granskaren instämde i att en kortare formulering är att föredra och gav den mening som nu används.</w:t>
+      </w:r>
+    </w:p>
+    <w:p>
+      <w:pPr>
+        <w:pStyle w:val="Heading2"/>
+      </w:pPr>
+      <w:r>
+        <w:t xml:space="preserve">W2 och W5: svetsgods- eller passpunkt utanför axlarna</w:t>
+      </w:r>
+    </w:p>
+    <w:p>
+      <w:pPr>
+        <w:spacing w:before="160" w:after="60"/>
+      </w:pPr>
+      <w:r>
+        <w:rPr>
+          <w:b/>
+          <w:bCs/>
+          <w:color w:val="1380a4"/>
+          <w:sz w:val="20"/>
+          <w:szCs w:val="20"/>
+        </w:rPr>
+        <w:t xml:space="preserve">Text i appen</w:t>
+      </w:r>
+    </w:p>
+    <w:p>
+      <w:pPr>
+        <w:pBdr>
+          <w:left w:val="single" w:color="1380a4" w:sz="12" w:space="8"/>
+        </w:pBdr>
+        <w:spacing w:after="120" w:line="280"/>
+        <w:ind w:left="567"/>
+      </w:pPr>
+      <w:r>
+        <w:rPr>
+          <w:i/>
+          <w:iCs/>
+          <w:sz w:val="20"/>
+          <w:szCs w:val="20"/>
+        </w:rPr>
+        <w:t xml:space="preserve">“The weld metal point lies outside the diagram area and no FN prediction is possible.”</w:t>
+      </w:r>
+    </w:p>
+    <w:p>
+      <w:pPr>
+        <w:pBdr>
+          <w:left w:val="single" w:color="1380a4" w:sz="12" w:space="8"/>
+        </w:pBdr>
+        <w:spacing w:after="120" w:line="280"/>
+        <w:ind w:left="567"/>
+      </w:pPr>
+      <w:r>
+        <w:rPr>
+          <w:i/>
+          <w:iCs/>
+          <w:sz w:val="20"/>
+          <w:szCs w:val="20"/>
+        </w:rPr>
+        <w:t xml:space="preserve">“One or more intermediate pass points lie outside the diagram area.”</w:t>
+      </w:r>
+    </w:p>
+    <w:p>
+      <w:pPr>
+        <w:spacing w:before="160" w:after="60"/>
+      </w:pPr>
+      <w:r>
+        <w:rPr>
+          <w:b/>
+          <w:bCs/>
+          <w:color w:val="1380a4"/>
+          <w:sz w:val="20"/>
+          <w:szCs w:val="20"/>
+        </w:rPr>
+        <w:t xml:space="preserve">Underlag och bedömning</w:t>
+      </w:r>
+    </w:p>
+    <w:p>
+      <w:pPr>
+        <w:spacing w:after="160" w:line="300"/>
+      </w:pPr>
+      <w:r>
+        <w:t xml:space="preserve">Geometriska fakta om den ritade ytan; inget källpåstående görs. Formuleringen följer den som beslutades för Schaefflerappen (”prediction is not possible”).</w:t>
+      </w:r>
+    </w:p>
+    <w:p>
+      <w:pPr>
+        <w:pStyle w:val="Heading2"/>
+      </w:pPr>
+      <w:r>
+        <w:t xml:space="preserve">W3: svetsgods utanför iso-FN-linjerna; martensit</w:t>
+      </w:r>
+    </w:p>
+    <w:p>
+      <w:pPr>
+        <w:spacing w:before="160" w:after="60"/>
+      </w:pPr>
+      <w:r>
+        <w:rPr>
+          <w:b/>
+          <w:bCs/>
+          <w:color w:val="1380a4"/>
+          <w:sz w:val="20"/>
+          <w:szCs w:val="20"/>
+        </w:rPr>
+        <w:t xml:space="preserve">Text i appen</w:t>
+      </w:r>
+    </w:p>
+    <w:p>
+      <w:pPr>
+        <w:pBdr>
+          <w:left w:val="single" w:color="1380a4" w:sz="12" w:space="8"/>
+        </w:pBdr>
+        <w:spacing w:after="120" w:line="280"/>
+        <w:ind w:left="567"/>
+      </w:pPr>
+      <w:r>
+        <w:rPr>
+          <w:i/>
+          <w:iCs/>
+          <w:sz w:val="20"/>
+          <w:szCs w:val="20"/>
+        </w:rPr>
+        <w:t xml:space="preserve">“The weld metal point lies outside the region covered by the iso-FN lines; extending the lines could give erroneous predictions.”</w:t>
+      </w:r>
+    </w:p>
+    <w:p>
+      <w:pPr>
+        <w:spacing w:before="160" w:after="60"/>
+      </w:pPr>
+      <w:r>
+        <w:rPr>
+          <w:b/>
+          <w:bCs/>
+          <w:color w:val="1380a4"/>
+          <w:sz w:val="20"/>
+          <w:szCs w:val="20"/>
+        </w:rPr>
+        <w:t xml:space="preserve">Utlösning</w:t>
+      </w:r>
+    </w:p>
+    <w:p>
+      <w:pPr>
+        <w:spacing w:after="160" w:line="300"/>
+      </w:pPr>
+      <w:r>
+        <w:t xml:space="preserve">Den slutliga svetsgodspunkten ligger innanför axlarna, men FN-interpolationen ger inget värde, det vill säga punkten ligger utanför solfjädern av iso-FN-linjer (typiskt nedanför och till vänster om den).</w:t>
+      </w:r>
+    </w:p>
+    <w:p>
+      <w:pPr>
+        <w:spacing w:before="160" w:after="60"/>
+      </w:pPr>
+      <w:r>
+        <w:rPr>
+          <w:b/>
+          <w:bCs/>
+          <w:color w:val="1380a4"/>
+          <w:sz w:val="20"/>
+          <w:szCs w:val="20"/>
+        </w:rPr>
+        <w:t xml:space="preserve">Underlag</w:t>
+      </w:r>
+    </w:p>
+    <w:p>
+      <w:pPr>
+        <w:spacing w:after="160" w:line="300"/>
+      </w:pPr>
+      <w:r>
+        <w:t xml:space="preserve">Meningen kommer från figurtexten till fig. 6 i 1992-artikeln. Två tidigare inslag har tagits bort: en separat ”martensitrisk”-varning som utlöstes av ett fast hörn inne i diagrammet (borttagen 6 september; saknade stöd i källorna), och en andra mening i den här varningen om martensit under de nedre FN-linjerna (borttagen 9 september på granskarens begäran: ingen hänvisning till martensit eller andra diagram).</w:t>
+      </w:r>
+    </w:p>
+    <w:p>
+      <w:pPr>
+        <w:pBdr>
+          <w:left w:val="single" w:color="1380a4" w:sz="12" w:space="8"/>
+        </w:pBdr>
+        <w:spacing w:after="40" w:line="280"/>
+        <w:ind w:left="567"/>
+      </w:pPr>
+      <w:r>
+        <w:rPr>
+          <w:i/>
+          <w:iCs/>
+          <w:sz w:val="20"/>
+          <w:szCs w:val="20"/>
+        </w:rPr>
+        <w:t xml:space="preserve">“The FN prediction is only accurate for weld compositions that fall within the bounds of the iso-FN lines (0 to 100 FN) that are drawn on the diagram. The limits of the diagram were determined by the extent of the database, and extension of the lines could result in erroneous predictions.”</w:t>
+      </w:r>
+    </w:p>
+    <w:p>
+      <w:pPr>
+        <w:spacing w:after="160"/>
+        <w:ind w:left="567"/>
+      </w:pPr>
+      <w:r>
+        <w:rPr>
+          <w:color w:val="555555"/>
+          <w:sz w:val="18"/>
+          <w:szCs w:val="18"/>
+        </w:rPr>
+        <w:t xml:space="preserve">– Kotecki &amp; Siewert 1992, Fig. 6 caption</w:t>
+      </w:r>
+    </w:p>
+    <w:p>
+      <w:pPr>
+        <w:pBdr>
+          <w:left w:val="single" w:color="1380a4" w:sz="12" w:space="8"/>
+        </w:pBdr>
+        <w:spacing w:after="40" w:line="280"/>
+        <w:ind w:left="567"/>
+      </w:pPr>
+      <w:r>
+        <w:rPr>
+          <w:i/>
+          <w:iCs/>
+          <w:sz w:val="20"/>
+          <w:szCs w:val="20"/>
+        </w:rPr>
+        <w:t xml:space="preserve">“For some Crₑₖ and Niₑₖ values beyond the lower limits of the FN lines in the WRC-1992 diagram, martensite may be found in the weld metals. […] Because of the differing effects of Mn in the two temperature ranges, it is not possible to include a single line bounding martensite-containing weld metals on the WRC-1992 diagram.”</w:t>
+      </w:r>
+    </w:p>
+    <w:p>
+      <w:pPr>
+        <w:spacing w:after="160"/>
+        <w:ind w:left="567"/>
+      </w:pPr>
+      <w:r>
+        <w:rPr>
+          <w:color w:val="555555"/>
+          <w:sz w:val="18"/>
+          <w:szCs w:val="18"/>
+        </w:rPr>
+        <w:t xml:space="preserve">– Kotecki &amp; Siewert 1992, p. 173-s</w:t>
+      </w:r>
+    </w:p>
+    <w:p>
+      <w:pPr>
+        <w:pBdr>
+          <w:left w:val="single" w:color="1380a4" w:sz="12" w:space="8"/>
+        </w:pBdr>
+        <w:spacing w:after="40" w:line="280"/>
+        <w:ind w:left="567"/>
+      </w:pPr>
+      <w:r>
+        <w:rPr>
+          <w:i/>
+          <w:iCs/>
+          <w:sz w:val="20"/>
+          <w:szCs w:val="20"/>
+        </w:rPr>
+        <w:t xml:space="preserve">“Therefore, a line denoting the region where martensite and austenite could coexist was not included. Examination of the lower-left region of the map does not reveal a change in line slope and so the effect of martensite seems small for the commercially useful data we studied.”</w:t>
+      </w:r>
+    </w:p>
+    <w:p>
+      <w:pPr>
+        <w:spacing w:after="160"/>
+        <w:ind w:left="567"/>
+      </w:pPr>
+      <w:r>
+        <w:rPr>
+          <w:color w:val="555555"/>
+          <w:sz w:val="18"/>
+          <w:szCs w:val="18"/>
+        </w:rPr>
+        <w:t xml:space="preserve">– Siewert, McCowan &amp; Olson 1988, p. 293-s</w:t>
+      </w:r>
+    </w:p>
+    <w:p>
+      <w:pPr>
+        <w:spacing w:before="160" w:after="60"/>
+      </w:pPr>
+      <w:r>
+        <w:rPr>
+          <w:b/>
+          <w:bCs/>
+          <w:color w:val="1380a4"/>
+          <w:sz w:val="20"/>
+          <w:szCs w:val="20"/>
+        </w:rPr>
+        <w:t xml:space="preserve">Bedömning</w:t>
+      </w:r>
+    </w:p>
+    <w:p>
+      <w:pPr>
+        <w:spacing w:after="160" w:line="300"/>
+      </w:pPr>
+      <w:r>
+        <w:rPr>
+          <w:b/>
+          <w:bCs/>
+        </w:rPr>
+        <w:t xml:space="preserve">Verifierat och granskat.</w:t>
+      </w:r>
+      <w:r>
+        <w:t xml:space="preserve"> Granskaren uteslöt varje hänvisning till martensit eller andra diagram i appen; martensitcitaten ovan står kvar här enbart som bakgrund.</w:t>
+      </w:r>
+    </w:p>
+    <w:p>
+      <w:pPr>
+        <w:pStyle w:val="Heading2"/>
+      </w:pPr>
+      <w:r>
+        <w:t xml:space="preserve">W4: noggrannhet över 18 FN</w:t>
+      </w:r>
+    </w:p>
+    <w:p>
+      <w:pPr>
+        <w:spacing w:before="160" w:after="60"/>
+      </w:pPr>
+      <w:r>
+        <w:rPr>
+          <w:b/>
+          <w:bCs/>
+          <w:color w:val="1380a4"/>
+          <w:sz w:val="20"/>
+          <w:szCs w:val="20"/>
+        </w:rPr>
+        <w:t xml:space="preserve">Text i appen</w:t>
+      </w:r>
+    </w:p>
+    <w:p>
+      <w:pPr>
+        <w:pBdr>
+          <w:left w:val="single" w:color="1380a4" w:sz="12" w:space="8"/>
+        </w:pBdr>
+        <w:spacing w:after="120" w:line="280"/>
+        <w:ind w:left="567"/>
+      </w:pPr>
+      <w:r>
+        <w:rPr>
+          <w:i/>
+          <w:iCs/>
+          <w:sz w:val="20"/>
+          <w:szCs w:val="20"/>
+        </w:rPr>
+        <w:t xml:space="preserve">“Accuracy of the WRC-1992 prediction (Siewert, McCowan &amp; Olson 1988): below 18 FN, 84 % of predictions fall within ±2.5 FN; above 18 FN, 70 % fall within ±9 FN.”</w:t>
+      </w:r>
+    </w:p>
+    <w:p>
+      <w:pPr>
+        <w:spacing w:before="160" w:after="60"/>
+      </w:pPr>
+      <w:r>
+        <w:rPr>
+          <w:b/>
+          <w:bCs/>
+          <w:color w:val="1380a4"/>
+          <w:sz w:val="20"/>
+          <w:szCs w:val="20"/>
+        </w:rPr>
+        <w:t xml:space="preserve">Utlösning</w:t>
+      </w:r>
+    </w:p>
+    <w:p>
+      <w:pPr>
+        <w:spacing w:after="160" w:line="300"/>
+      </w:pPr>
+      <w:r>
+        <w:t xml:space="preserve">Fast notis i DISCLAIMER_NOTES, visas alltid. Fram till den 6 september var det en varning över 50 FN (en siffra som inte finns i någon av artiklarna), därefter en varning över 18 FN; den 9 september bad granskaren om en generell, alltid synlig text med båda noggrannhetssiffrorna och referensen.</w:t>
+      </w:r>
+    </w:p>
+    <w:p>
+      <w:pPr>
+        <w:spacing w:before="160" w:after="60"/>
+      </w:pPr>
+      <w:r>
+        <w:rPr>
+          <w:b/>
+          <w:bCs/>
+          <w:color w:val="1380a4"/>
+          <w:sz w:val="20"/>
+          <w:szCs w:val="20"/>
+        </w:rPr>
+        <w:t xml:space="preserve">Underlag</w:t>
+      </w:r>
+    </w:p>
+    <w:p>
+      <w:pPr>
+        <w:spacing w:after="160" w:line="300"/>
+      </w:pPr>
+      <w:r>
+        <w:t xml:space="preserve">Tabell 4 i 1988-artikeln delar databasen vid 18 FN och redovisar andelen prediktioner inom en tolerans: under 18 FN 84 % inom ±2,5 FN; över 18 FN 70 % inom ±9 FN. Tröskeln och båda toleranserna i apptexten är hämtade ur den tabellen. 1992-artikelns egna duplexdata (tabell 1, 30–100 FN) visar ett standardfel på ungefär 8 FN, vilket stämmer med detta.</w:t>
+      </w:r>
+    </w:p>
+    <w:p>
+      <w:pPr>
+        <w:pBdr>
+          <w:left w:val="single" w:color="1380a4" w:sz="12" w:space="8"/>
+        </w:pBdr>
+        <w:spacing w:after="40" w:line="280"/>
+        <w:ind w:left="567"/>
+      </w:pPr>
+      <w:r>
+        <w:rPr>
+          <w:i/>
+          <w:iCs/>
+          <w:sz w:val="20"/>
+          <w:szCs w:val="20"/>
+        </w:rPr>
+        <w:t xml:space="preserve">“Table 4 — Comparison of the Accuracy of the Schaeffler Diagram and the Proposed Diagram. FN &gt; 18: error less than ± 9 FN — Schaeffler 35 %, Proposed 70 % (124 / 125 cases). FN &lt; 18: error less than ± 2.5 FN — Schaeffler 52 %, Proposed 84 % (771 / 740 cases).”</w:t>
+      </w:r>
+    </w:p>
+    <w:p>
+      <w:pPr>
+        <w:spacing w:after="160"/>
+        <w:ind w:left="567"/>
+      </w:pPr>
+      <w:r>
+        <w:rPr>
+          <w:color w:val="555555"/>
+          <w:sz w:val="18"/>
+          <w:szCs w:val="18"/>
+        </w:rPr>
+        <w:t xml:space="preserve">– Siewert, McCowan &amp; Olson 1988, p. 296-s (table transcribed)</w:t>
+      </w:r>
+    </w:p>
+    <w:p>
+      <w:pPr>
+        <w:spacing w:before="160" w:after="60"/>
+      </w:pPr>
+      <w:r>
+        <w:rPr>
+          <w:b/>
+          <w:bCs/>
+          <w:color w:val="1380a4"/>
+          <w:sz w:val="20"/>
+          <w:szCs w:val="20"/>
+        </w:rPr>
+        <w:t xml:space="preserve">Bedömning</w:t>
+      </w:r>
+    </w:p>
+    <w:p>
+      <w:pPr>
+        <w:spacing w:after="160" w:line="300"/>
+      </w:pPr>
+      <w:r>
+        <w:rPr>
+          <w:b/>
+          <w:bCs/>
+        </w:rPr>
+        <w:t xml:space="preserve">Verifierat och granskat.</w:t>
+      </w:r>
+      <w:r>
+        <w:t xml:space="preserve"> Notisen anger nu båda procentsatserna och båda toleranserna exakt som i tabell 4.</w:t>
+      </w:r>
+    </w:p>
+    <w:p>
+      <w:pPr>
+        <w:pStyle w:val="Heading2"/>
+      </w:pPr>
+      <w:r>
+        <w:t xml:space="preserve">D: den fasta ansvarsfriskrivningen och referenserna</w:t>
+      </w:r>
+    </w:p>
+    <w:p>
+      <w:pPr>
+        <w:spacing w:before="160" w:after="60"/>
+      </w:pPr>
+      <w:r>
+        <w:rPr>
+          <w:b/>
+          <w:bCs/>
+          <w:color w:val="1380a4"/>
+          <w:sz w:val="20"/>
+          <w:szCs w:val="20"/>
+        </w:rPr>
+        <w:t xml:space="preserve">Text i appen</w:t>
+      </w:r>
+    </w:p>
+    <w:p>
+      <w:pPr>
+        <w:pBdr>
+          <w:left w:val="single" w:color="1380a4" w:sz="12" w:space="8"/>
+        </w:pBdr>
+        <w:spacing w:after="120" w:line="280"/>
+        <w:ind w:left="567"/>
+      </w:pPr>
+      <w:r>
+        <w:rPr>
+          <w:i/>
+          <w:iCs/>
+          <w:sz w:val="20"/>
+          <w:szCs w:val="20"/>
+        </w:rPr>
+        <w:t xml:space="preserve">“WRC-1992 predicts Ferrite Number (FN). The prediction applies to weld metal at arc-welding cooling rates and is only valid inside the drawn iso-FN lines. The prediction is subject to the limitations and assumptions of the original WRC-1992 research.”</w:t>
+      </w:r>
+    </w:p>
+    <w:p>
+      <w:pPr>
+        <w:pBdr>
+          <w:left w:val="single" w:color="1380a4" w:sz="12" w:space="8"/>
+        </w:pBdr>
+        <w:spacing w:after="120" w:line="280"/>
+        <w:ind w:left="567"/>
+      </w:pPr>
+      <w:r>
+        <w:rPr>
+          <w:i/>
+          <w:iCs/>
+          <w:sz w:val="20"/>
+          <w:szCs w:val="20"/>
+        </w:rPr>
+        <w:t xml:space="preserve">“Kotecki, D. J. &amp; Siewert, T. A. (1992). WRC-1992 constitution diagram for stainless steel weld metals: a modification of the WRC-1988 diagram. Welding Journal 71(5), 171-s–178-s.”</w:t>
+      </w:r>
+    </w:p>
+    <w:p>
+      <w:pPr>
+        <w:pBdr>
+          <w:left w:val="single" w:color="1380a4" w:sz="12" w:space="8"/>
+        </w:pBdr>
+        <w:spacing w:after="120" w:line="280"/>
+        <w:ind w:left="567"/>
+      </w:pPr>
+      <w:r>
+        <w:rPr>
+          <w:i/>
+          <w:iCs/>
+          <w:sz w:val="20"/>
+          <w:szCs w:val="20"/>
+        </w:rPr>
+        <w:t xml:space="preserve">“Siewert, T. A., McCowan, C. N. &amp; Olson, D. L. (1988). Ferrite Number prediction to 100 FN in stainless steel weld metal. Welding Journal 67(12), 289-s–298-s.”</w:t>
+      </w:r>
+    </w:p>
+    <w:p>
+      <w:pPr>
+        <w:spacing w:before="160" w:after="60"/>
+      </w:pPr>
+      <w:r>
+        <w:rPr>
+          <w:b/>
+          <w:bCs/>
+          <w:color w:val="1380a4"/>
+          <w:sz w:val="20"/>
+          <w:szCs w:val="20"/>
+        </w:rPr>
+        <w:t xml:space="preserve">Underlag</w:t>
+      </w:r>
+    </w:p>
+    <w:p>
+      <w:pPr>
+        <w:spacing w:after="160" w:line="300"/>
+      </w:pPr>
+      <w:r>
+        <w:t xml:space="preserve">Formuleringen är granskarens (9 september). Två påståenden kvarstår: bågsvetsningens svalningshastigheter (1988-databasen togs nästan helt fram med belagda elektroder enligt AWS A5.4, och artikeln utvärderar uttryckligen inte andra förhållanden) och giltighet innanför de ritade linjerna (fig. 6-texten citerad under W3). Den tidigare förklaringen av FN kontra volymprocent ferrit ströks på granskarens begäran.</w:t>
+      </w:r>
+    </w:p>
+    <w:p>
+      <w:pPr>
+        <w:pBdr>
+          <w:left w:val="single" w:color="1380a4" w:sz="12" w:space="8"/>
+        </w:pBdr>
+        <w:spacing w:after="40" w:line="280"/>
+        <w:ind w:left="567"/>
+      </w:pPr>
+      <w:r>
+        <w:rPr>
+          <w:i/>
+          <w:iCs/>
+          <w:sz w:val="20"/>
+          <w:szCs w:val="20"/>
+        </w:rPr>
+        <w:t xml:space="preserve">“In fact, the great majority of data were produced with shielded metal arc electrodes conforming to AWS Specification A5.4. […] The equation was not evaluated for welds produced under conditions outside those specified in A5.4.”</w:t>
+      </w:r>
+    </w:p>
+    <w:p>
+      <w:pPr>
+        <w:spacing w:after="160"/>
+        <w:ind w:left="567"/>
+      </w:pPr>
+      <w:r>
+        <w:rPr>
+          <w:color w:val="555555"/>
+          <w:sz w:val="18"/>
+          <w:szCs w:val="18"/>
+        </w:rPr>
+        <w:t xml:space="preserve">– Siewert, McCowan &amp; Olson 1988, p. 291-s</w:t>
+      </w:r>
+    </w:p>
+    <w:p>
+      <w:pPr>
+        <w:spacing w:before="160" w:after="60"/>
+      </w:pPr>
+      <w:r>
+        <w:rPr>
+          <w:b/>
+          <w:bCs/>
+          <w:color w:val="1380a4"/>
+          <w:sz w:val="20"/>
+          <w:szCs w:val="20"/>
+        </w:rPr>
+        <w:t xml:space="preserve">Bedömning</w:t>
+      </w:r>
+    </w:p>
+    <w:p>
+      <w:pPr>
+        <w:spacing w:after="160" w:line="300"/>
+      </w:pPr>
+      <w:r>
+        <w:rPr>
+          <w:b/>
+          <w:bCs/>
+        </w:rPr>
+        <w:t xml:space="preserve">Verifierat och granskat.</w:t>
+      </w:r>
+      <w:r>
+        <w:t xml:space="preserve"> Ansvarsfriskrivningen är nu granskarens text, följd av de två fasta notiserna (L och W4) och de två referenserna.</w:t>
+      </w:r>
+    </w:p>
+    <w:p>
+      <w:pPr>
+        <w:pStyle w:val="Heading1"/>
+      </w:pPr>
+      <w:r>
+        <w:t xml:space="preserve">4. Gjorda ändringar</w:t>
+      </w:r>
+    </w:p>
+    <w:p>
+      <w:pPr>
+        <w:pStyle w:val="Heading2"/>
+      </w:pPr>
+      <w:r>
+        <w:t xml:space="preserve">4.1 Andra revisionen, 9 september 2026 (granskarens kommentarer)</w:t>
       </w:r>
     </w:p>
     <w:p>
@@ -1400,7 +2215,14 @@
         <w:spacing w:after="100" w:line="280"/>
       </w:pPr>
       <w:r>
-        <w:t xml:space="preserve">Är formuleringen ”the FN prediction is not reliable” godtagbar, eller bör den lyda ”less accurate”, eftersom källan bara kvantifierar en försämrad noggrannhet?</w:t>
+        <w:rPr>
+          <w:b/>
+          <w:bCs/>
+        </w:rPr>
+        <w:t xml:space="preserve">Varningarna för sammansättningsgränser ersatta av en fast notis</w:t>
+      </w:r>
+      <w:r>
+        <w:t xml:space="preserve"> med lydelsen ”less accurate” och 1988-referensen.</w:t>
       </w:r>
     </w:p>
     <w:p>
@@ -1413,919 +2235,14 @@
         <w:spacing w:after="100" w:line="280"/>
       </w:pPr>
       <w:r>
-        <w:t xml:space="preserve">1988-artikeln begränsar också C (0,01–0,15) och Cr/Ni (15–32 / 5–25) genom databasens omfång. Bör appen varna även för dem?</w:t>
-      </w:r>
-    </w:p>
-    <w:p>
-      <w:pPr>
-        <w:pStyle w:val="Heading2"/>
-      </w:pPr>
-      <w:r>
-        <w:t xml:space="preserve">W1: grundmaterial utanför axlarna</w:t>
-      </w:r>
-    </w:p>
-    <w:p>
-      <w:pPr>
-        <w:spacing w:before="160" w:after="60"/>
-      </w:pPr>
-      <w:r>
-        <w:rPr>
-          <w:b/>
-          <w:bCs/>
-          <w:color w:val="1380a4"/>
-          <w:sz w:val="20"/>
-          <w:szCs w:val="20"/>
-        </w:rPr>
-        <w:t xml:space="preserve">Text i appen</w:t>
-      </w:r>
-    </w:p>
-    <w:p>
-      <w:pPr>
-        <w:pBdr>
-          <w:left w:val="single" w:color="1380a4" w:sz="12" w:space="8"/>
-        </w:pBdr>
-        <w:spacing w:after="120" w:line="280"/>
-        <w:ind w:left="567"/>
-      </w:pPr>
-      <w:r>
-        <w:rPr>
-          <w:i/>
-          <w:iCs/>
-          <w:sz w:val="20"/>
-          <w:szCs w:val="20"/>
-        </w:rPr>
-        <w:t xml:space="preserve">“Material B (EN 10025-2 / S355J2) lies outside the diagram axes. That is normal for unalloyed base metals — the mixing line remains valid as long as the weld metal point lands on the diagram.”</w:t>
-      </w:r>
-    </w:p>
-    <w:p>
-      <w:pPr>
-        <w:spacing w:before="160" w:after="60"/>
-      </w:pPr>
-      <w:r>
-        <w:rPr>
-          <w:b/>
-          <w:bCs/>
-          <w:color w:val="1380a4"/>
-          <w:sz w:val="20"/>
-          <w:szCs w:val="20"/>
-        </w:rPr>
-        <w:t xml:space="preserve">Utlösning</w:t>
-      </w:r>
-    </w:p>
-    <w:p>
-      <w:pPr>
-        <w:spacing w:after="160" w:line="300"/>
-      </w:pPr>
-      <w:r>
-        <w:t xml:space="preserve">Material A, B eller C med Cr</w:t>
-      </w:r>
-      <w:r>
-        <w:rPr>
-          <w:vertAlign w:val="subscript"/>
-        </w:rPr>
-        <w:t xml:space="preserve">eq</w:t>
-      </w:r>
-      <w:r>
-        <w:t xml:space="preserve"> utanför 17–31 eller Ni</w:t>
-      </w:r>
-      <w:r>
-        <w:rPr>
-          <w:vertAlign w:val="subscript"/>
-        </w:rPr>
-        <w:t xml:space="preserve">eq</w:t>
-      </w:r>
-      <w:r>
-        <w:t xml:space="preserve"> utanför 9–18 (de ritade WRC-1992-axlarna). Utlöses för S355 i varje blandförbandsexempel.</w:t>
-      </w:r>
-    </w:p>
-    <w:p>
-      <w:pPr>
-        <w:spacing w:before="160" w:after="60"/>
-      </w:pPr>
-      <w:r>
-        <w:rPr>
-          <w:b/>
-          <w:bCs/>
-          <w:color w:val="1380a4"/>
-          <w:sz w:val="20"/>
-          <w:szCs w:val="20"/>
-        </w:rPr>
-        <w:t xml:space="preserve">Underlag</w:t>
-      </w:r>
-    </w:p>
-    <w:p>
-      <w:pPr>
-        <w:spacing w:after="160" w:line="300"/>
-      </w:pPr>
-      <w:r>
-        <w:t xml:space="preserve">1992-artikeln inför de förlängda axlarna just för detta fall och räknar två exempel med olegerade grundmaterial (AISI 1050 och ASTM A36) placerade vid Cr</w:t>
-      </w:r>
-      <w:r>
-        <w:rPr>
-          <w:vertAlign w:val="subscript"/>
-        </w:rPr>
-        <w:t xml:space="preserve">eq</w:t>
-      </w:r>
-      <w:r>
-        <w:t xml:space="preserve"> = 0, för vilka inget FN kan beräknas men vars punkter förankrar utspädningslinjen.</w:t>
-      </w:r>
-    </w:p>
-    <w:p>
-      <w:pPr>
-        <w:pBdr>
-          <w:left w:val="single" w:color="1380a4" w:sz="12" w:space="8"/>
-        </w:pBdr>
-        <w:spacing w:after="40" w:line="280"/>
-        <w:ind w:left="567"/>
-      </w:pPr>
-      <w:r>
-        <w:rPr>
-          <w:i/>
-          <w:iCs/>
-          <w:sz w:val="20"/>
-          <w:szCs w:val="20"/>
-        </w:rPr>
-        <w:t xml:space="preserve">“Although Ferrite Numbers do not exist for weld deposits of low Crₑₖ and Niₑₖ, the positions of such alloys can still be located by extrapolated Crₑₖ and Niₑₖ units on the WRC-1992 diagram. Dilution calculations are based on linear combinations of the compositions, and the extended axes of the diagram allow visualization of the concept.”</w:t>
-      </w:r>
-    </w:p>
-    <w:p>
-      <w:pPr>
-        <w:spacing w:after="160"/>
-        <w:ind w:left="567"/>
-      </w:pPr>
-      <w:r>
-        <w:rPr>
-          <w:color w:val="555555"/>
-          <w:sz w:val="18"/>
-          <w:szCs w:val="18"/>
-        </w:rPr>
-        <w:t xml:space="preserve">– Kotecki &amp; Siewert 1992, p. 173-s</w:t>
-      </w:r>
-    </w:p>
-    <w:p>
-      <w:pPr>
-        <w:pBdr>
-          <w:left w:val="single" w:color="1380a4" w:sz="12" w:space="8"/>
-        </w:pBdr>
-        <w:spacing w:after="40" w:line="280"/>
-        <w:ind w:left="567"/>
-      </w:pPr>
-      <w:r>
-        <w:rPr>
-          <w:i/>
-          <w:iCs/>
-          <w:sz w:val="20"/>
-          <w:szCs w:val="20"/>
-        </w:rPr>
-        <w:t xml:space="preserve">“The Crₑₖ and Niₑₖ for the AISI 1050 steel (0.0 and 17.50, respectively) do not permit an FN calculation for this material.”</w:t>
-      </w:r>
-    </w:p>
-    <w:p>
-      <w:pPr>
-        <w:spacing w:after="160"/>
-        <w:ind w:left="567"/>
-      </w:pPr>
-      <w:r>
-        <w:rPr>
-          <w:color w:val="555555"/>
-          <w:sz w:val="18"/>
-          <w:szCs w:val="18"/>
-        </w:rPr>
-        <w:t xml:space="preserve">– Kotecki &amp; Siewert 1992, p. 173-s</w:t>
-      </w:r>
-    </w:p>
-    <w:p>
-      <w:pPr>
-        <w:spacing w:before="160" w:after="60"/>
-      </w:pPr>
-      <w:r>
-        <w:rPr>
-          <w:b/>
-          <w:bCs/>
-          <w:color w:val="1380a4"/>
-          <w:sz w:val="20"/>
-          <w:szCs w:val="20"/>
-        </w:rPr>
-        <w:t xml:space="preserve">Bedömning</w:t>
-      </w:r>
-    </w:p>
-    <w:p>
-      <w:pPr>
-        <w:spacing w:after="160" w:line="300"/>
-      </w:pPr>
-      <w:r>
-        <w:rPr>
-          <w:b/>
-          <w:bCs/>
-        </w:rPr>
-        <w:t xml:space="preserve">Verifierat.</w:t>
-      </w:r>
-      <w:r>
-        <w:t xml:space="preserve"> Texten lugnar avsiktligt snarare än varnar, eftersom situationen i den här appen är det normala undervisningsfallet. Granskaren kanske föredrar en kortare formulering.</w:t>
-      </w:r>
-    </w:p>
-    <w:p>
-      <w:pPr>
-        <w:pStyle w:val="Heading2"/>
-      </w:pPr>
-      <w:r>
-        <w:t xml:space="preserve">W2 och W5: svetsgods- eller passpunkt utanför axlarna</w:t>
-      </w:r>
-    </w:p>
-    <w:p>
-      <w:pPr>
-        <w:spacing w:before="160" w:after="60"/>
-      </w:pPr>
-      <w:r>
-        <w:rPr>
-          <w:b/>
-          <w:bCs/>
-          <w:color w:val="1380a4"/>
-          <w:sz w:val="20"/>
-          <w:szCs w:val="20"/>
-        </w:rPr>
-        <w:t xml:space="preserve">Text i appen</w:t>
-      </w:r>
-    </w:p>
-    <w:p>
-      <w:pPr>
-        <w:pBdr>
-          <w:left w:val="single" w:color="1380a4" w:sz="12" w:space="8"/>
-        </w:pBdr>
-        <w:spacing w:after="120" w:line="280"/>
-        <w:ind w:left="567"/>
-      </w:pPr>
-      <w:r>
-        <w:rPr>
-          <w:i/>
-          <w:iCs/>
-          <w:sz w:val="20"/>
-          <w:szCs w:val="20"/>
-        </w:rPr>
-        <w:t xml:space="preserve">“The weld metal point lies outside the diagram area and no FN prediction is possible.”</w:t>
-      </w:r>
-    </w:p>
-    <w:p>
-      <w:pPr>
-        <w:pBdr>
-          <w:left w:val="single" w:color="1380a4" w:sz="12" w:space="8"/>
-        </w:pBdr>
-        <w:spacing w:after="120" w:line="280"/>
-        <w:ind w:left="567"/>
-      </w:pPr>
-      <w:r>
-        <w:rPr>
-          <w:i/>
-          <w:iCs/>
-          <w:sz w:val="20"/>
-          <w:szCs w:val="20"/>
-        </w:rPr>
-        <w:t xml:space="preserve">“One or more intermediate pass points lie outside the diagram area.”</w:t>
-      </w:r>
-    </w:p>
-    <w:p>
-      <w:pPr>
-        <w:spacing w:before="160" w:after="60"/>
-      </w:pPr>
-      <w:r>
-        <w:rPr>
-          <w:b/>
-          <w:bCs/>
-          <w:color w:val="1380a4"/>
-          <w:sz w:val="20"/>
-          <w:szCs w:val="20"/>
-        </w:rPr>
-        <w:t xml:space="preserve">Underlag och bedömning</w:t>
-      </w:r>
-    </w:p>
-    <w:p>
-      <w:pPr>
-        <w:spacing w:after="160" w:line="300"/>
-      </w:pPr>
-      <w:r>
-        <w:t xml:space="preserve">Geometriska fakta om den ritade ytan; inget källpåstående görs. Formuleringen följer den som beslutades för Schaefflerappen (”prediction is not possible”).</w:t>
-      </w:r>
-    </w:p>
-    <w:p>
-      <w:pPr>
-        <w:pStyle w:val="Heading2"/>
-      </w:pPr>
-      <w:r>
-        <w:t xml:space="preserve">W3: svetsgods utanför iso-FN-linjerna; martensit</w:t>
-      </w:r>
-    </w:p>
-    <w:p>
-      <w:pPr>
-        <w:spacing w:before="160" w:after="60"/>
-      </w:pPr>
-      <w:r>
-        <w:rPr>
-          <w:b/>
-          <w:bCs/>
-          <w:color w:val="1380a4"/>
-          <w:sz w:val="20"/>
-          <w:szCs w:val="20"/>
-        </w:rPr>
-        <w:t xml:space="preserve">Text i appen</w:t>
-      </w:r>
-    </w:p>
-    <w:p>
-      <w:pPr>
-        <w:pBdr>
-          <w:left w:val="single" w:color="1380a4" w:sz="12" w:space="8"/>
-        </w:pBdr>
-        <w:spacing w:after="120" w:line="280"/>
-        <w:ind w:left="567"/>
-      </w:pPr>
-      <w:r>
-        <w:rPr>
-          <w:i/>
-          <w:iCs/>
-          <w:sz w:val="20"/>
-          <w:szCs w:val="20"/>
-        </w:rPr>
-        <w:t xml:space="preserve">“The weld metal point lies outside the region covered by the iso-FN lines; extending the lines could give erroneous predictions. Below the lower FN lines martensite may form, which the WRC-1992 diagram does not show.”</w:t>
-      </w:r>
-    </w:p>
-    <w:p>
-      <w:pPr>
-        <w:spacing w:before="160" w:after="60"/>
-      </w:pPr>
-      <w:r>
-        <w:rPr>
-          <w:b/>
-          <w:bCs/>
-          <w:color w:val="1380a4"/>
-          <w:sz w:val="20"/>
-          <w:szCs w:val="20"/>
-        </w:rPr>
-        <w:t xml:space="preserve">Utlösning</w:t>
-      </w:r>
-    </w:p>
-    <w:p>
-      <w:pPr>
-        <w:spacing w:after="160" w:line="300"/>
-      </w:pPr>
-      <w:r>
-        <w:t xml:space="preserve">Den slutliga svetsgodspunkten ligger innanför axlarna, men FN-interpolationen ger inget värde, det vill säga punkten ligger utanför solfjädern av iso-FN-linjer (typiskt nedanför och till vänster om den).</w:t>
-      </w:r>
-    </w:p>
-    <w:p>
-      <w:pPr>
-        <w:spacing w:before="160" w:after="60"/>
-      </w:pPr>
-      <w:r>
-        <w:rPr>
-          <w:b/>
-          <w:bCs/>
-          <w:color w:val="1380a4"/>
-          <w:sz w:val="20"/>
-          <w:szCs w:val="20"/>
-        </w:rPr>
-        <w:t xml:space="preserve">Underlag</w:t>
-      </w:r>
-    </w:p>
-    <w:p>
-      <w:pPr>
-        <w:spacing w:after="160" w:line="300"/>
-      </w:pPr>
-      <w:r>
-        <w:t xml:space="preserve">Båda meningarna kommer från primärartiklarna. Fram till den 6 september 2026 hade appen dessutom en separat ”martensitrisk”-varning som utlöstes av ett fast hörn (Cr</w:t>
-      </w:r>
-      <w:r>
-        <w:rPr>
-          <w:vertAlign w:val="subscript"/>
-        </w:rPr>
-        <w:t xml:space="preserve">eq</w:t>
-      </w:r>
-      <w:r>
-        <w:t xml:space="preserve"> &lt; 19 och Ni</w:t>
-      </w:r>
-      <w:r>
-        <w:rPr>
-          <w:vertAlign w:val="subscript"/>
-        </w:rPr>
-        <w:t xml:space="preserve">eq</w:t>
-      </w:r>
-      <w:r>
-        <w:t xml:space="preserve"> &lt; 11,5) inne i diagrammet; den triggern saknade stöd i källorna, som placerar martensitområdet bortom de nedre FN-linjerna, och togs bort.</w:t>
-      </w:r>
-    </w:p>
-    <w:p>
-      <w:pPr>
-        <w:pBdr>
-          <w:left w:val="single" w:color="1380a4" w:sz="12" w:space="8"/>
-        </w:pBdr>
-        <w:spacing w:after="40" w:line="280"/>
-        <w:ind w:left="567"/>
-      </w:pPr>
-      <w:r>
-        <w:rPr>
-          <w:i/>
-          <w:iCs/>
-          <w:sz w:val="20"/>
-          <w:szCs w:val="20"/>
-        </w:rPr>
-        <w:t xml:space="preserve">“The FN prediction is only accurate for weld compositions that fall within the bounds of the iso-FN lines (0 to 100 FN) that are drawn on the diagram. The limits of the diagram were determined by the extent of the database, and extension of the lines could result in erroneous predictions.”</w:t>
-      </w:r>
-    </w:p>
-    <w:p>
-      <w:pPr>
-        <w:spacing w:after="160"/>
-        <w:ind w:left="567"/>
-      </w:pPr>
-      <w:r>
-        <w:rPr>
-          <w:color w:val="555555"/>
-          <w:sz w:val="18"/>
-          <w:szCs w:val="18"/>
-        </w:rPr>
-        <w:t xml:space="preserve">– Kotecki &amp; Siewert 1992, Fig. 6 caption</w:t>
-      </w:r>
-    </w:p>
-    <w:p>
-      <w:pPr>
-        <w:pBdr>
-          <w:left w:val="single" w:color="1380a4" w:sz="12" w:space="8"/>
-        </w:pBdr>
-        <w:spacing w:after="40" w:line="280"/>
-        <w:ind w:left="567"/>
-      </w:pPr>
-      <w:r>
-        <w:rPr>
-          <w:i/>
-          <w:iCs/>
-          <w:sz w:val="20"/>
-          <w:szCs w:val="20"/>
-        </w:rPr>
-        <w:t xml:space="preserve">“For some Crₑₖ and Niₑₖ values beyond the lower limits of the FN lines in the WRC-1992 diagram, martensite may be found in the weld metals. […] Because of the differing effects of Mn in the two temperature ranges, it is not possible to include a single line bounding martensite-containing weld metals on the WRC-1992 diagram.”</w:t>
-      </w:r>
-    </w:p>
-    <w:p>
-      <w:pPr>
-        <w:spacing w:after="160"/>
-        <w:ind w:left="567"/>
-      </w:pPr>
-      <w:r>
-        <w:rPr>
-          <w:color w:val="555555"/>
-          <w:sz w:val="18"/>
-          <w:szCs w:val="18"/>
-        </w:rPr>
-        <w:t xml:space="preserve">– Kotecki &amp; Siewert 1992, p. 173-s</w:t>
-      </w:r>
-    </w:p>
-    <w:p>
-      <w:pPr>
-        <w:pBdr>
-          <w:left w:val="single" w:color="1380a4" w:sz="12" w:space="8"/>
-        </w:pBdr>
-        <w:spacing w:after="40" w:line="280"/>
-        <w:ind w:left="567"/>
-      </w:pPr>
-      <w:r>
-        <w:rPr>
-          <w:i/>
-          <w:iCs/>
-          <w:sz w:val="20"/>
-          <w:szCs w:val="20"/>
-        </w:rPr>
-        <w:t xml:space="preserve">“Therefore, a line denoting the region where martensite and austenite could coexist was not included. Examination of the lower-left region of the map does not reveal a change in line slope and so the effect of martensite seems small for the commercially useful data we studied.”</w:t>
-      </w:r>
-    </w:p>
-    <w:p>
-      <w:pPr>
-        <w:spacing w:after="160"/>
-        <w:ind w:left="567"/>
-      </w:pPr>
-      <w:r>
-        <w:rPr>
-          <w:color w:val="555555"/>
-          <w:sz w:val="18"/>
-          <w:szCs w:val="18"/>
-        </w:rPr>
-        <w:t xml:space="preserve">– Siewert, McCowan &amp; Olson 1988, p. 293-s</w:t>
-      </w:r>
-    </w:p>
-    <w:p>
-      <w:pPr>
-        <w:spacing w:before="160" w:after="60"/>
-      </w:pPr>
-      <w:r>
-        <w:rPr>
-          <w:b/>
-          <w:bCs/>
-          <w:color w:val="1380a4"/>
-          <w:sz w:val="20"/>
-          <w:szCs w:val="20"/>
-        </w:rPr>
-        <w:t xml:space="preserve">Bedömning</w:t>
-      </w:r>
-    </w:p>
-    <w:p>
-      <w:pPr>
-        <w:spacing w:after="160" w:line="300"/>
-      </w:pPr>
-      <w:r>
-        <w:rPr>
-          <w:b/>
-          <w:bCs/>
-        </w:rPr>
-        <w:t xml:space="preserve">Verifierat.</w:t>
-      </w:r>
-      <w:r>
-        <w:t xml:space="preserve"> En punkt för granskaren: appen hänvisar inte längre användaren till Schaefflerdiagrammet för martensitområdet. 1992-artikeln gör själv den jämförelsen (”In the Schaeffler diagram, such weld metals were indicated below and to the left of a diagonal line”), så en kort korshänvisning skulle ha stöd i källan om den önskas.</w:t>
-      </w:r>
-    </w:p>
-    <w:p>
-      <w:pPr>
-        <w:pStyle w:val="Heading2"/>
-      </w:pPr>
-      <w:r>
-        <w:t xml:space="preserve">W4: noggrannhet över 18 FN</w:t>
-      </w:r>
-    </w:p>
-    <w:p>
-      <w:pPr>
-        <w:spacing w:before="160" w:after="60"/>
-      </w:pPr>
-      <w:r>
-        <w:rPr>
-          <w:b/>
-          <w:bCs/>
-          <w:color w:val="1380a4"/>
-          <w:sz w:val="20"/>
-          <w:szCs w:val="20"/>
-        </w:rPr>
-        <w:t xml:space="preserve">Text i appen</w:t>
-      </w:r>
-    </w:p>
-    <w:p>
-      <w:pPr>
-        <w:pBdr>
-          <w:left w:val="single" w:color="1380a4" w:sz="12" w:space="8"/>
-        </w:pBdr>
-        <w:spacing w:after="120" w:line="280"/>
-        <w:ind w:left="567"/>
-      </w:pPr>
-      <w:r>
-        <w:rPr>
-          <w:i/>
-          <w:iCs/>
-          <w:sz w:val="20"/>
-          <w:szCs w:val="20"/>
-        </w:rPr>
-        <w:t xml:space="preserve">“Predicted FN ≈ 56 is above 18, where the accuracy of the WRC-1992 prediction drops from about ±2.5 FN to about ±9 FN.”</w:t>
-      </w:r>
-    </w:p>
-    <w:p>
-      <w:pPr>
-        <w:spacing w:before="160" w:after="60"/>
-      </w:pPr>
-      <w:r>
-        <w:rPr>
-          <w:b/>
-          <w:bCs/>
-          <w:color w:val="1380a4"/>
-          <w:sz w:val="20"/>
-          <w:szCs w:val="20"/>
-        </w:rPr>
-        <w:t xml:space="preserve">Utlösning</w:t>
-      </w:r>
-    </w:p>
-    <w:p>
-      <w:pPr>
-        <w:spacing w:after="160" w:line="300"/>
-      </w:pPr>
-      <w:r>
-        <w:t xml:space="preserve">Predikterat FN &gt; 18 för den slutliga svetsgodspunkten. Fram till den 6 september 2026 var tröskeln 50, en siffra som inte förekommer i någon av artiklarna.</w:t>
-      </w:r>
-    </w:p>
-    <w:p>
-      <w:pPr>
-        <w:spacing w:before="160" w:after="60"/>
-      </w:pPr>
-      <w:r>
-        <w:rPr>
-          <w:b/>
-          <w:bCs/>
-          <w:color w:val="1380a4"/>
-          <w:sz w:val="20"/>
-          <w:szCs w:val="20"/>
-        </w:rPr>
-        <w:t xml:space="preserve">Underlag</w:t>
-      </w:r>
-    </w:p>
-    <w:p>
-      <w:pPr>
-        <w:spacing w:after="160" w:line="300"/>
-      </w:pPr>
-      <w:r>
-        <w:t xml:space="preserve">Tabell 4 i 1988-artikeln delar databasen vid 18 FN och redovisar andelen prediktioner inom en tolerans: under 18 FN 84 % inom ±2,5 FN; över 18 FN 70 % inom ±9 FN. Tröskeln och båda toleranserna i apptexten är hämtade ur den tabellen. 1992-artikelns egna duplexdata (tabell 1, 30–100 FN) visar ett standardfel på ungefär 8 FN, vilket stämmer med detta.</w:t>
-      </w:r>
-    </w:p>
-    <w:p>
-      <w:pPr>
-        <w:pBdr>
-          <w:left w:val="single" w:color="1380a4" w:sz="12" w:space="8"/>
-        </w:pBdr>
-        <w:spacing w:after="40" w:line="280"/>
-        <w:ind w:left="567"/>
-      </w:pPr>
-      <w:r>
-        <w:rPr>
-          <w:i/>
-          <w:iCs/>
-          <w:sz w:val="20"/>
-          <w:szCs w:val="20"/>
-        </w:rPr>
-        <w:t xml:space="preserve">“Table 4 — Comparison of the Accuracy of the Schaeffler Diagram and the Proposed Diagram. FN &gt; 18: error less than ± 9 FN — Schaeffler 35 %, Proposed 70 % (124 / 125 cases). FN &lt; 18: error less than ± 2.5 FN — Schaeffler 52 %, Proposed 84 % (771 / 740 cases).”</w:t>
-      </w:r>
-    </w:p>
-    <w:p>
-      <w:pPr>
-        <w:spacing w:after="160"/>
-        <w:ind w:left="567"/>
-      </w:pPr>
-      <w:r>
-        <w:rPr>
-          <w:color w:val="555555"/>
-          <w:sz w:val="18"/>
-          <w:szCs w:val="18"/>
-        </w:rPr>
-        <w:t xml:space="preserve">– Siewert, McCowan &amp; Olson 1988, p. 296-s (table transcribed)</w:t>
-      </w:r>
-    </w:p>
-    <w:p>
-      <w:pPr>
-        <w:spacing w:before="160" w:after="60"/>
-      </w:pPr>
-      <w:r>
-        <w:rPr>
-          <w:b/>
-          <w:bCs/>
-          <w:color w:val="1380a4"/>
-          <w:sz w:val="20"/>
-          <w:szCs w:val="20"/>
-        </w:rPr>
-        <w:t xml:space="preserve">Bedömning</w:t>
-      </w:r>
-    </w:p>
-    <w:p>
-      <w:pPr>
-        <w:spacing w:after="160" w:line="300"/>
-      </w:pPr>
-      <w:r>
-        <w:rPr>
-          <w:b/>
-          <w:bCs/>
-        </w:rPr>
-        <w:t xml:space="preserve">Verifierat.</w:t>
-      </w:r>
-      <w:r>
-        <w:t xml:space="preserve"> Frasen ”drops from about ±2.5 FN to about ±9 FN” komprimerar ”84 % inom ±2,5” och ”70 % inom ±9” till en bisats; granskaren kanske vill att procentsatserna också visas.</w:t>
-      </w:r>
-    </w:p>
-    <w:p>
-      <w:pPr>
-        <w:pStyle w:val="Heading2"/>
-      </w:pPr>
-      <w:r>
-        <w:t xml:space="preserve">D: den fasta ansvarsfriskrivningen och referenserna</w:t>
-      </w:r>
-    </w:p>
-    <w:p>
-      <w:pPr>
-        <w:spacing w:before="160" w:after="60"/>
-      </w:pPr>
-      <w:r>
-        <w:rPr>
-          <w:b/>
-          <w:bCs/>
-          <w:color w:val="1380a4"/>
-          <w:sz w:val="20"/>
-          <w:szCs w:val="20"/>
-        </w:rPr>
-        <w:t xml:space="preserve">Text i appen</w:t>
-      </w:r>
-    </w:p>
-    <w:p>
-      <w:pPr>
-        <w:pBdr>
-          <w:left w:val="single" w:color="1380a4" w:sz="12" w:space="8"/>
-        </w:pBdr>
-        <w:spacing w:after="120" w:line="280"/>
-        <w:ind w:left="567"/>
-      </w:pPr>
-      <w:r>
-        <w:rPr>
-          <w:i/>
-          <w:iCs/>
-          <w:sz w:val="20"/>
-          <w:szCs w:val="20"/>
-        </w:rPr>
-        <w:t xml:space="preserve">“WRC-1992 predicts Ferrite Number (FN), a magnetically defined scale — not volume-% ferrite; the two agree only at low FN (100 FN corresponds to roughly 65 vol-% ferrite). The prediction applies to weld metal at arc-welding cooling rates and is only valid inside the drawn iso-FN lines. The prediction is subject to the limitations and assumptions of the original WRC-1992 research.”</w:t>
-      </w:r>
-    </w:p>
-    <w:p>
-      <w:pPr>
-        <w:pBdr>
-          <w:left w:val="single" w:color="1380a4" w:sz="12" w:space="8"/>
-        </w:pBdr>
-        <w:spacing w:after="120" w:line="280"/>
-        <w:ind w:left="567"/>
-      </w:pPr>
-      <w:r>
-        <w:rPr>
-          <w:i/>
-          <w:iCs/>
-          <w:sz w:val="20"/>
-          <w:szCs w:val="20"/>
-        </w:rPr>
-        <w:t xml:space="preserve">“Kotecki, D. J. &amp; Siewert, T. A. (1992). WRC-1992 constitution diagram for stainless steel weld metals: a modification of the WRC-1988 diagram. Welding Journal 71(5), 171-s–178-s.”</w:t>
-      </w:r>
-    </w:p>
-    <w:p>
-      <w:pPr>
-        <w:pBdr>
-          <w:left w:val="single" w:color="1380a4" w:sz="12" w:space="8"/>
-        </w:pBdr>
-        <w:spacing w:after="120" w:line="280"/>
-        <w:ind w:left="567"/>
-      </w:pPr>
-      <w:r>
-        <w:rPr>
-          <w:i/>
-          <w:iCs/>
-          <w:sz w:val="20"/>
-          <w:szCs w:val="20"/>
-        </w:rPr>
-        <w:t xml:space="preserve">“Siewert, T. A., McCowan, C. N. &amp; Olson, D. L. (1988). Ferrite Number prediction to 100 FN in stainless steel weld metal. Welding Journal 67(12), 289-s–298-s.”</w:t>
-      </w:r>
-    </w:p>
-    <w:p>
-      <w:pPr>
-        <w:spacing w:before="160" w:after="60"/>
-      </w:pPr>
-      <w:r>
-        <w:rPr>
-          <w:b/>
-          <w:bCs/>
-          <w:color w:val="1380a4"/>
-          <w:sz w:val="20"/>
-          <w:szCs w:val="20"/>
-        </w:rPr>
-        <w:t xml:space="preserve">Underlag</w:t>
-      </w:r>
-    </w:p>
-    <w:p>
-      <w:pPr>
-        <w:spacing w:after="160" w:line="300"/>
-      </w:pPr>
-      <w:r>
-        <w:t xml:space="preserve">Fyra påståenden. (1) FN är en magnetisk skala skild från volymprocent: anges i båda artiklarna. (2) 100 FN motsvarar ungefär 65 vol-%: 1988, s. 289-s; detta ersatte en tidigare, obelagd faktor ”0,7 × FN”. (3) Bågsvetsningens svalningshastigheter: 1988-databasen togs nästan helt fram med belagda elektroder enligt AWS A5.4, och artikeln utvärderar uttryckligen inte andra förhållanden. (4) Giltighet innanför de ritade linjerna: fig. 6-texten citerad under W3.</w:t>
-      </w:r>
-    </w:p>
-    <w:p>
-      <w:pPr>
-        <w:pBdr>
-          <w:left w:val="single" w:color="1380a4" w:sz="12" w:space="8"/>
-        </w:pBdr>
-        <w:spacing w:after="40" w:line="280"/>
-        <w:ind w:left="567"/>
-      </w:pPr>
-      <w:r>
-        <w:rPr>
-          <w:i/>
-          <w:iCs/>
-          <w:sz w:val="20"/>
-          <w:szCs w:val="20"/>
-        </w:rPr>
-        <w:t xml:space="preserve">“[…] the Schaeffler diagram makes its predictions in terms of “percent ferrite.” Later, this was found to be imprecise and the magnetically based “Ferrite Number” (FN) unit was developed for the specification and determination of ferrite content.”</w:t>
-      </w:r>
-    </w:p>
-    <w:p>
-      <w:pPr>
-        <w:spacing w:after="160"/>
-        <w:ind w:left="567"/>
-      </w:pPr>
-      <w:r>
-        <w:rPr>
-          <w:color w:val="555555"/>
-          <w:sz w:val="18"/>
-          <w:szCs w:val="18"/>
-        </w:rPr>
-        <w:t xml:space="preserve">– Kotecki &amp; Siewert 1992, p. 171-s</w:t>
-      </w:r>
-    </w:p>
-    <w:p>
-      <w:pPr>
-        <w:pBdr>
-          <w:left w:val="single" w:color="1380a4" w:sz="12" w:space="8"/>
-        </w:pBdr>
-        <w:spacing w:after="40" w:line="280"/>
-        <w:ind w:left="567"/>
-      </w:pPr>
-      <w:r>
-        <w:rPr>
-          <w:i/>
-          <w:iCs/>
-          <w:sz w:val="20"/>
-          <w:szCs w:val="20"/>
-        </w:rPr>
-        <w:t xml:space="preserve">“[…] ferrite contents to 100 FN (roughly equivalent to 65 vol-% ferrite).”</w:t>
-      </w:r>
-    </w:p>
-    <w:p>
-      <w:pPr>
-        <w:spacing w:after="160"/>
-        <w:ind w:left="567"/>
-      </w:pPr>
-      <w:r>
-        <w:rPr>
-          <w:color w:val="555555"/>
-          <w:sz w:val="18"/>
-          <w:szCs w:val="18"/>
-        </w:rPr>
-        <w:t xml:space="preserve">– Siewert, McCowan &amp; Olson 1988, p. 289-s</w:t>
-      </w:r>
-    </w:p>
-    <w:p>
-      <w:pPr>
-        <w:pBdr>
-          <w:left w:val="single" w:color="1380a4" w:sz="12" w:space="8"/>
-        </w:pBdr>
-        <w:spacing w:after="40" w:line="280"/>
-        <w:ind w:left="567"/>
-      </w:pPr>
-      <w:r>
-        <w:rPr>
-          <w:i/>
-          <w:iCs/>
-          <w:sz w:val="20"/>
-          <w:szCs w:val="20"/>
-        </w:rPr>
-        <w:t xml:space="preserve">“In fact, the great majority of data were produced with shielded metal arc electrodes conforming to AWS Specification A5.4. […] The equation was not evaluated for welds produced under conditions outside those specified in A5.4.”</w:t>
-      </w:r>
-    </w:p>
-    <w:p>
-      <w:pPr>
-        <w:spacing w:after="160"/>
-        <w:ind w:left="567"/>
-      </w:pPr>
-      <w:r>
-        <w:rPr>
-          <w:color w:val="555555"/>
-          <w:sz w:val="18"/>
-          <w:szCs w:val="18"/>
-        </w:rPr>
-        <w:t xml:space="preserve">– Siewert, McCowan &amp; Olson 1988, p. 291-s</w:t>
-      </w:r>
-    </w:p>
-    <w:p>
-      <w:pPr>
-        <w:spacing w:before="160" w:after="60"/>
-      </w:pPr>
-      <w:r>
-        <w:rPr>
-          <w:b/>
-          <w:bCs/>
-          <w:color w:val="1380a4"/>
-          <w:sz w:val="20"/>
-          <w:szCs w:val="20"/>
-        </w:rPr>
-        <w:t xml:space="preserve">Bedömning</w:t>
-      </w:r>
-    </w:p>
-    <w:p>
-      <w:pPr>
-        <w:spacing w:after="160" w:line="300"/>
-      </w:pPr>
-      <w:r>
-        <w:rPr>
-          <w:b/>
-          <w:bCs/>
-        </w:rPr>
-        <w:t xml:space="preserve">Verifierat.</w:t>
-      </w:r>
-      <w:r>
-        <w:t xml:space="preserve"> Slutmeningen och de två referenserna tillämpar principen som beslutades för Schaefflerappen.</w:t>
-      </w:r>
-    </w:p>
-    <w:p>
-      <w:pPr>
-        <w:pStyle w:val="Heading1"/>
-      </w:pPr>
-      <w:r>
-        <w:t xml:space="preserve">4. Ändringar gjorda den 6 september 2026</w:t>
-      </w:r>
-    </w:p>
-    <w:p>
-      <w:pPr>
-        <w:spacing w:after="160" w:line="300"/>
-      </w:pPr>
-      <w:r>
-        <w:t xml:space="preserve">För spårbarhetens skull: läget före revisionen och skälet till varje ändring:</w:t>
+        <w:rPr>
+          <w:b/>
+          <w:bCs/>
+        </w:rPr>
+        <w:t xml:space="preserve">W1 kortad till granskarens mening</w:t>
+      </w:r>
+      <w:r>
+        <w:t xml:space="preserve">, visas en gång utan materialnamn.</w:t>
       </w:r>
     </w:p>
     <w:p>
@@ -2342,10 +2259,10 @@
           <w:b/>
           <w:bCs/>
         </w:rPr>
-        <w:t xml:space="preserve">Mo-gräns 3,5 → 3 vikt-%.</w:t>
-      </w:r>
-      <w:r>
-        <w:t xml:space="preserve"> Koden och dess kommentar var oense (3,5 mot 3); 1988-slutsatserna säger 3.</w:t>
+        <w:t xml:space="preserve">W3: martensitmeningen borttagen</w:t>
+      </w:r>
+      <w:r>
+        <w:t xml:space="preserve">; ingen hänvisning till martensit eller andra diagram någonstans i appen.</w:t>
       </w:r>
     </w:p>
     <w:p>
@@ -2362,10 +2279,10 @@
           <w:b/>
           <w:bCs/>
         </w:rPr>
-        <w:t xml:space="preserve">FN-notis: tröskel 50 → 18, formulering ”less accurate” → ”±2,5 FN till ±9 FN”.</w:t>
-      </w:r>
-      <w:r>
-        <w:t xml:space="preserve"> Siffran 50 saknade källa; tabell 4 i 1988-artikeln ger 18 och toleranserna.</w:t>
+        <w:t xml:space="preserve">FN-varningen ersatt av en fast noggrannhetsnotis</w:t>
+      </w:r>
+      <w:r>
+        <w:t xml:space="preserve"> (84 % inom ±2,5 FN under 18 FN; 70 % inom ±9 FN över) med 1988-referensen.</w:t>
       </w:r>
     </w:p>
     <w:p>
@@ -2382,10 +2299,26 @@
           <w:b/>
           <w:bCs/>
         </w:rPr>
-        <w:t xml:space="preserve">Separat ”martensitrisk”-varning borttagen.</w:t>
-      </w:r>
-      <w:r>
-        <w:t xml:space="preserve"> Dess trigger, ett fast hörn inne i diagrammet, var appens egen konstruktion. Martensitanmärkningen följer nu med W3, där källorna placerar den.</w:t>
+        <w:t xml:space="preserve">Ansvarsfriskrivningen ersatt av granskarens text</w:t>
+      </w:r>
+      <w:r>
+        <w:t xml:space="preserve">; förklaringen av FN kontra volymprocent struken.</w:t>
+      </w:r>
+    </w:p>
+    <w:p>
+      <w:pPr>
+        <w:pStyle w:val="Heading2"/>
+      </w:pPr>
+      <w:r>
+        <w:t xml:space="preserve">4.2 Första revisionen, 6 september 2026 (källkontroll)</w:t>
+      </w:r>
+    </w:p>
+    <w:p>
+      <w:pPr>
+        <w:spacing w:after="160" w:line="300"/>
+      </w:pPr>
+      <w:r>
+        <w:t xml:space="preserve">Läget före den första revisionen och skälet till varje ändring:</w:t>
       </w:r>
     </w:p>
     <w:p>
@@ -2402,10 +2335,10 @@
           <w:b/>
           <w:bCs/>
         </w:rPr>
-        <w:t xml:space="preserve">Ansvarsfriskrivning: ”duplex weld metals at FN ≈ 50 hold roughly 0.7 × FN vol-%” → ”100 FN corresponds to roughly 65 vol-% ferrite”.</w:t>
-      </w:r>
-      <w:r>
-        <w:t xml:space="preserve"> Faktorn 0,7 kommer från senare arbeten som inte lästs för den här granskningen; siffran 65 vol-% finns i 1988-artikeln. Meningen ”Unlike Schaeffler, the model includes nitrogen and copper” ströks som onödig.</w:t>
+        <w:t xml:space="preserve">Mo-gräns 3,5 → 3 vikt-%.</w:t>
+      </w:r>
+      <w:r>
+        <w:t xml:space="preserve"> Koden och dess kommentar var oense (3,5 mot 3); 1988-slutsatserna säger 3.</w:t>
       </w:r>
     </w:p>
     <w:p>
@@ -2422,10 +2355,10 @@
           <w:b/>
           <w:bCs/>
         </w:rPr>
-        <w:t xml:space="preserve">Generellt begränsningspåstående och två referenser tillagda</w:t>
-      </w:r>
-      <w:r>
-        <w:t xml:space="preserve">, som i Schaefflerappen.</w:t>
+        <w:t xml:space="preserve">FN-notis: tröskel 50 → 18, formulering ”less accurate” → ”±2,5 FN till ±9 FN”.</w:t>
+      </w:r>
+      <w:r>
+        <w:t xml:space="preserve"> Siffran 50 saknade källa; tabell 4 i 1988-artikeln ger 18 och toleranserna.</w:t>
       </w:r>
     </w:p>
     <w:p>
@@ -2442,18 +2375,10 @@
           <w:b/>
           <w:bCs/>
         </w:rPr>
-        <w:t xml:space="preserve">Alla varningstexter kortade</w:t>
-      </w:r>
-      <w:r>
-        <w:t xml:space="preserve">; utanför-axlarna-texten för svetsgods lyder nu ”prediction is not possible”, som beslutat för Schaefflerappen.</w:t>
-      </w:r>
-    </w:p>
-    <w:p>
-      <w:pPr>
-        <w:pStyle w:val="Heading1"/>
-      </w:pPr>
-      <w:r>
-        <w:t xml:space="preserve">5. Checklista för granskaren</w:t>
+        <w:t xml:space="preserve">Separat ”martensitrisk”-varning borttagen.</w:t>
+      </w:r>
+      <w:r>
+        <w:t xml:space="preserve"> Dess trigger, ett fast hörn inne i diagrammet, var appens egen konstruktion. Martensitanmärkningen följer nu med W3, där källorna placerar den.</w:t>
       </w:r>
     </w:p>
     <w:p>
@@ -2466,7 +2391,14 @@
         <w:spacing w:after="100" w:line="280"/>
       </w:pPr>
       <w:r>
-        <w:t xml:space="preserve">L: ”not reliable” eller ”less accurate”? Lägga till C- och Cr/Ni-gränser ur databasen?</w:t>
+        <w:rPr>
+          <w:b/>
+          <w:bCs/>
+        </w:rPr>
+        <w:t xml:space="preserve">Ansvarsfriskrivning: ”duplex weld metals at FN ≈ 50 hold roughly 0.7 × FN vol-%” → ”100 FN corresponds to roughly 65 vol-% ferrite”.</w:t>
+      </w:r>
+      <w:r>
+        <w:t xml:space="preserve"> Faktorn 0,7 kommer från senare arbeten som inte lästs för den här granskningen; siffran 65 vol-% finns i 1988-artikeln. Meningen ”Unlike Schaeffler, the model includes nitrogen and copper” ströks som onödig.</w:t>
       </w:r>
     </w:p>
     <w:p>
@@ -2479,7 +2411,14 @@
         <w:spacing w:after="100" w:line="280"/>
       </w:pPr>
       <w:r>
-        <w:t xml:space="preserve">W1: behålla den förklarande texten eller korta till ett rent konstaterande?</w:t>
+        <w:rPr>
+          <w:b/>
+          <w:bCs/>
+        </w:rPr>
+        <w:t xml:space="preserve">Generellt begränsningspåstående och två referenser tillagda</w:t>
+      </w:r>
+      <w:r>
+        <w:t xml:space="preserve">, som i Schaefflerappen.</w:t>
       </w:r>
     </w:p>
     <w:p>
@@ -2492,7 +2431,30 @@
         <w:spacing w:after="100" w:line="280"/>
       </w:pPr>
       <w:r>
-        <w:t xml:space="preserve">W3: lägga till en kort korshänvisning till Schaefflerdiagrammet för martensitområdet (stöd i 1992, s. 173-s)?</w:t>
+        <w:rPr>
+          <w:b/>
+          <w:bCs/>
+        </w:rPr>
+        <w:t xml:space="preserve">Alla varningstexter kortade</w:t>
+      </w:r>
+      <w:r>
+        <w:t xml:space="preserve">; utanför-axlarna-texten för svetsgods lyder nu ”prediction is not possible”, som beslutat för Schaefflerappen.</w:t>
+      </w:r>
+    </w:p>
+    <w:p>
+      <w:pPr>
+        <w:pStyle w:val="Heading1"/>
+      </w:pPr>
+      <w:r>
+        <w:t xml:space="preserve">5. Granskningsläge</w:t>
+      </w:r>
+    </w:p>
+    <w:p>
+      <w:pPr>
+        <w:spacing w:after="160" w:line="300"/>
+      </w:pPr>
+      <w:r>
+        <w:t xml:space="preserve">Alla frågor i versionen från den 6 september besvarades av granskaren den 9 september och fördes in enligt avsnitt 4.1. En punkt kommenterades inte och kvarstår för en senare omgång:</w:t>
       </w:r>
     </w:p>
     <w:p>
@@ -2505,33 +2467,7 @@
         <w:spacing w:after="100" w:line="280"/>
       </w:pPr>
       <w:r>
-        <w:t xml:space="preserve">W4: visa procentsatserna (84 % / 70 %) vid sidan av toleranserna?</w:t>
-      </w:r>
-    </w:p>
-    <w:p>
-      <w:pPr>
-        <w:pStyle w:val="ListParagraph"/>
-        <w:numPr>
-          <w:ilvl w:val="0"/>
-          <w:numId w:val="2"/>
-        </w:numPr>
-        <w:spacing w:after="100" w:line="280"/>
-      </w:pPr>
-      <w:r>
-        <w:t xml:space="preserve">D: är ”100 FN corresponds to roughly 65 vol-%” rätt sätt att uttrycka FN–volymrelationen för studenter?</w:t>
-      </w:r>
-    </w:p>
-    <w:p>
-      <w:pPr>
-        <w:pStyle w:val="ListParagraph"/>
-        <w:numPr>
-          <w:ilvl w:val="0"/>
-          <w:numId w:val="2"/>
-        </w:numPr>
-        <w:spacing w:after="100" w:line="280"/>
-      </w:pPr>
-      <w:r>
-        <w:t xml:space="preserve">Något som originalartiklarna anger och som appen också borde varna för (t.ex. AF/FA-gränsen som varmsprickindikator, 1988 s. 296-s)?</w:t>
+        <w:t xml:space="preserve">Om AF/FA-gränsen för stelningsmod ska presenteras som varmsprickindikator (1988, s. 296-s).</w:t>
       </w:r>
     </w:p>
     <w:p>

</xml_diff>

<commit_message>
Remove FN-vs-volume-% remark from the result panel (reviewer request)
Co-Authored-By: Claude Fable 5 <noreply@anthropic.com>
</commit_message>
<xml_diff>
--- a/WRC-1992-app-varningsgranskning-SV.docx
+++ b/WRC-1992-app-varningsgranskning-SV.docx
@@ -2303,6 +2303,26 @@
       </w:r>
       <w:r>
         <w:t xml:space="preserve">; förklaringen av FN kontra volymprocent struken.</w:t>
+      </w:r>
+    </w:p>
+    <w:p>
+      <w:pPr>
+        <w:pStyle w:val="ListParagraph"/>
+        <w:numPr>
+          <w:ilvl w:val="0"/>
+          <w:numId w:val="2"/>
+        </w:numPr>
+        <w:spacing w:after="100" w:line="280"/>
+      </w:pPr>
+      <w:r>
+        <w:rPr>
+          <w:b/>
+          <w:bCs/>
+        </w:rPr>
+        <w:t xml:space="preserve">Resultatpanelen: parentesen ”(≈ vol-% ferrite at low FN)” efter det predikterade FN borttagen</w:t>
+      </w:r>
+      <w:r>
+        <w:t xml:space="preserve"> på granskarens begäran; panelen anger nu bara FN.</w:t>
       </w:r>
     </w:p>
     <w:p>

</xml_diff>